<commit_message>
Fix SysTick crash during boot by adding flag_can_ready
</commit_message>
<xml_diff>
--- a/02_Communication/CANBoardPractice_CANCommunication_Final.docx
+++ b/02_Communication/CANBoardPractice_CANCommunication_Final.docx
@@ -1,6 +1,6 @@
 
 <file path=word/document.xml><?xml version="1.0" encoding="utf-8"?>
-<w:document xmlns:wpc="http://schemas.microsoft.com/office/word/2010/wordprocessingCanvas" xmlns:cx="http://schemas.microsoft.com/office/drawing/2014/chartex" xmlns:cx1="http://schemas.microsoft.com/office/drawing/2015/9/8/chartex" xmlns:cx2="http://schemas.microsoft.com/office/drawing/2015/10/21/chartex" xmlns:cx3="http://schemas.microsoft.com/office/drawing/2016/5/9/chartex" xmlns:cx4="http://schemas.microsoft.com/office/drawing/2016/5/10/chartex" xmlns:cx5="http://schemas.microsoft.com/office/drawing/2016/5/11/chartex" xmlns:cx6="http://schemas.microsoft.com/office/drawing/2016/5/12/chartex" xmlns:cx7="http://schemas.microsoft.com/office/drawing/2016/5/13/chartex" xmlns:cx8="http://schemas.microsoft.com/office/drawing/2016/5/14/chartex" xmlns:mc="http://schemas.openxmlformats.org/markup-compatibility/2006" xmlns:aink="http://schemas.microsoft.com/office/drawing/2016/ink" xmlns:am3d="http://schemas.microsoft.com/office/drawing/2017/model3d" xmlns:o="urn:schemas-microsoft-com:office:office" xmlns:oel="http://schemas.microsoft.com/office/2019/extlst" xmlns:r="http://schemas.openxmlformats.org/officeDocument/2006/relationships" xmlns:m="http://schemas.openxmlformats.org/officeDocument/2006/math" xmlns:v="urn:schemas-microsoft-com:vml" xmlns:wp14="http://schemas.microsoft.com/office/word/2010/wordprocessingDrawing" xmlns:wp="http://schemas.openxmlformats.org/drawingml/2006/wordprocessingDrawing" xmlns:w10="urn:schemas-microsoft-com:office:word" xmlns:w="http://schemas.openxmlformats.org/wordprocessingml/2006/main" xmlns:w14="http://schemas.microsoft.com/office/word/2010/wordml" xmlns:w15="http://schemas.microsoft.com/office/word/2012/wordml" xmlns:w16cei="http://schemas.microsoft.com/office/word/2026/wordml/cei" xmlns:w16cex="http://schemas.microsoft.com/office/word/2018/wordml/cex" xmlns:w16cid="http://schemas.microsoft.com/office/word/2016/wordml/cid" xmlns:w16="http://schemas.microsoft.com/office/word/2018/wordml" xmlns:w16du="http://schemas.microsoft.com/office/word/2023/wordml/word16du" xmlns:w16sdtdh="http://schemas.microsoft.com/office/word/2020/wordml/sdtdatahash" xmlns:w16sdtfl="http://schemas.microsoft.com/office/word/2024/wordml/sdtformatlock" xmlns:w16se="http://schemas.microsoft.com/office/word/2015/wordml/symex" xmlns:wpg="http://schemas.microsoft.com/office/word/2010/wordprocessingGroup" xmlns:wpi="http://schemas.microsoft.com/office/word/2010/wordprocessingInk" xmlns:wne="http://schemas.microsoft.com/office/word/2006/wordml" xmlns:wps="http://schemas.microsoft.com/office/word/2010/wordprocessingShape" mc:Ignorable="w14 w15 w16se w16cid w16 w16cex w16sdtdh w16sdtfl w16du wp14">
+<w:document xmlns:wpc="http://schemas.microsoft.com/office/word/2010/wordprocessingCanvas" xmlns:cx="http://schemas.microsoft.com/office/drawing/2014/chartex" xmlns:cx1="http://schemas.microsoft.com/office/drawing/2015/9/8/chartex" xmlns:cx2="http://schemas.microsoft.com/office/drawing/2015/10/21/chartex" xmlns:cx3="http://schemas.microsoft.com/office/drawing/2016/5/9/chartex" xmlns:cx4="http://schemas.microsoft.com/office/drawing/2016/5/10/chartex" xmlns:cx5="http://schemas.microsoft.com/office/drawing/2016/5/11/chartex" xmlns:cx6="http://schemas.microsoft.com/office/drawing/2016/5/12/chartex" xmlns:cx7="http://schemas.microsoft.com/office/drawing/2016/5/13/chartex" xmlns:cx8="http://schemas.microsoft.com/office/drawing/2016/5/14/chartex" xmlns:mc="http://schemas.openxmlformats.org/markup-compatibility/2006" xmlns:aink="http://schemas.microsoft.com/office/drawing/2016/ink" xmlns:am3d="http://schemas.microsoft.com/office/drawing/2017/model3d" xmlns:o="urn:schemas-microsoft-com:office:office" xmlns:r="http://schemas.openxmlformats.org/officeDocument/2006/relationships" xmlns:m="http://schemas.openxmlformats.org/officeDocument/2006/math" xmlns:v="urn:schemas-microsoft-com:vml" xmlns:wp14="http://schemas.microsoft.com/office/word/2010/wordprocessingDrawing" xmlns:wp="http://schemas.openxmlformats.org/drawingml/2006/wordprocessingDrawing" xmlns:w10="urn:schemas-microsoft-com:office:word" xmlns:w="http://schemas.openxmlformats.org/wordprocessingml/2006/main" xmlns:w14="http://schemas.microsoft.com/office/word/2010/wordml" xmlns:w15="http://schemas.microsoft.com/office/word/2012/wordml" xmlns:w16cid="http://schemas.microsoft.com/office/word/2016/wordml/cid" xmlns:w16se="http://schemas.microsoft.com/office/word/2015/wordml/symex" xmlns:wpg="http://schemas.microsoft.com/office/word/2010/wordprocessingGroup" xmlns:wpi="http://schemas.microsoft.com/office/word/2010/wordprocessingInk" xmlns:wne="http://schemas.microsoft.com/office/word/2006/wordml" xmlns:wps="http://schemas.microsoft.com/office/word/2010/wordprocessingShape" mc:Ignorable="w14 w15 w16se w16cid wp14">
   <w:body>
     <w:p>
       <w:pPr>
@@ -59,29 +59,13 @@
         <w:t>After this practice, the students will have</w:t>
       </w:r>
       <w:r>
-        <w:t xml:space="preserve"> </w:t>
-      </w:r>
-      <w:proofErr w:type="gramStart"/>
-      <w:r>
-        <w:t>experience</w:t>
-      </w:r>
-      <w:proofErr w:type="gramEnd"/>
-      <w:r>
-        <w:t xml:space="preserve"> how to </w:t>
+        <w:t xml:space="preserve"> experience how to </w:t>
       </w:r>
       <w:r>
         <w:t xml:space="preserve">implement </w:t>
       </w:r>
       <w:r>
-        <w:t xml:space="preserve">CAN communication </w:t>
-      </w:r>
-      <w:proofErr w:type="gramStart"/>
-      <w:r>
-        <w:t>protocol</w:t>
-      </w:r>
-      <w:proofErr w:type="gramEnd"/>
-      <w:r>
-        <w:t xml:space="preserve"> to receive and transmit d</w:t>
+        <w:t>CAN communication protocol to receive and transmit d</w:t>
       </w:r>
       <w:r>
         <w:t>ata.</w:t>
@@ -240,25 +224,7 @@
           <w:sz w:val="20"/>
           <w:szCs w:val="20"/>
         </w:rPr>
-        <w:t xml:space="preserve">The student </w:t>
-      </w:r>
-      <w:proofErr w:type="gramStart"/>
-      <w:r>
-        <w:rPr>
-          <w:rFonts w:ascii="Arial" w:hAnsi="Arial" w:cs="Arial"/>
-          <w:sz w:val="20"/>
-          <w:szCs w:val="20"/>
-        </w:rPr>
-        <w:t>has to</w:t>
-      </w:r>
-      <w:proofErr w:type="gramEnd"/>
-      <w:r>
-        <w:rPr>
-          <w:rFonts w:ascii="Arial" w:hAnsi="Arial" w:cs="Arial"/>
-          <w:sz w:val="20"/>
-          <w:szCs w:val="20"/>
-        </w:rPr>
-        <w:t xml:space="preserve"> implement CAN read and CAN write</w:t>
+        <w:t>The student has to implement CAN read and CAN write</w:t>
       </w:r>
       <w:r>
         <w:rPr>
@@ -775,7 +741,6 @@
                 <w:szCs w:val="20"/>
               </w:rPr>
             </w:pPr>
-            <w:proofErr w:type="spellStart"/>
             <w:r>
               <w:rPr>
                 <w:rFonts w:ascii="Arial" w:hAnsi="Arial" w:cs="Arial"/>
@@ -784,7 +749,6 @@
               </w:rPr>
               <w:t>tBit</w:t>
             </w:r>
-            <w:proofErr w:type="spellEnd"/>
           </w:p>
         </w:tc>
         <w:tc>
@@ -978,23 +942,13 @@
                 <w:szCs w:val="20"/>
               </w:rPr>
             </w:pPr>
-            <w:proofErr w:type="spellStart"/>
             <w:r>
               <w:rPr>
                 <w:rFonts w:ascii="Arial" w:hAnsi="Arial" w:cs="Arial"/>
                 <w:sz w:val="20"/>
                 <w:szCs w:val="20"/>
               </w:rPr>
-              <w:t>fHSCAN</w:t>
-            </w:r>
-            <w:proofErr w:type="spellEnd"/>
-            <w:r>
-              <w:rPr>
-                <w:rFonts w:ascii="Arial" w:hAnsi="Arial" w:cs="Arial"/>
-                <w:sz w:val="20"/>
-                <w:szCs w:val="20"/>
-              </w:rPr>
-              <w:t xml:space="preserve"> = 500kbps (± 0.4 %)</w:t>
+              <w:t>fHSCAN = 500kbps (± 0.4 %)</w:t>
             </w:r>
           </w:p>
         </w:tc>
@@ -1025,23 +979,13 @@
                 <w:szCs w:val="20"/>
               </w:rPr>
             </w:pPr>
-            <w:proofErr w:type="spellStart"/>
             <w:r>
               <w:rPr>
                 <w:rFonts w:ascii="Arial" w:hAnsi="Arial" w:cs="Arial"/>
                 <w:sz w:val="20"/>
                 <w:szCs w:val="20"/>
               </w:rPr>
-              <w:t>Tq</w:t>
-            </w:r>
-            <w:proofErr w:type="spellEnd"/>
-            <w:r>
-              <w:rPr>
-                <w:rFonts w:ascii="Arial" w:hAnsi="Arial" w:cs="Arial"/>
-                <w:sz w:val="20"/>
-                <w:szCs w:val="20"/>
-              </w:rPr>
-              <w:t xml:space="preserve"> quantity</w:t>
+              <w:t>Tq quantity</w:t>
             </w:r>
           </w:p>
         </w:tc>
@@ -1192,7 +1136,6 @@
                 <w:szCs w:val="20"/>
               </w:rPr>
             </w:pPr>
-            <w:proofErr w:type="spellStart"/>
             <w:r>
               <w:rPr>
                 <w:rFonts w:ascii="Arial" w:hAnsi="Arial" w:cs="Arial"/>
@@ -1201,7 +1144,6 @@
               </w:rPr>
               <w:t>Tq</w:t>
             </w:r>
-            <w:proofErr w:type="spellEnd"/>
           </w:p>
         </w:tc>
         <w:tc>
@@ -1283,7 +1225,6 @@
                 <w:szCs w:val="20"/>
               </w:rPr>
             </w:pPr>
-            <w:proofErr w:type="spellStart"/>
             <w:r>
               <w:rPr>
                 <w:rFonts w:ascii="Arial" w:hAnsi="Arial" w:cs="Arial"/>
@@ -1292,7 +1233,6 @@
               </w:rPr>
               <w:t>tSP</w:t>
             </w:r>
-            <w:proofErr w:type="spellEnd"/>
           </w:p>
         </w:tc>
         <w:tc>
@@ -1624,7 +1564,6 @@
                 <w:szCs w:val="20"/>
               </w:rPr>
             </w:pPr>
-            <w:proofErr w:type="spellStart"/>
             <w:r>
               <w:rPr>
                 <w:rFonts w:ascii="Arial" w:hAnsi="Arial" w:cs="Arial"/>
@@ -1633,7 +1572,6 @@
               </w:rPr>
               <w:t>Tq</w:t>
             </w:r>
-            <w:proofErr w:type="spellEnd"/>
           </w:p>
         </w:tc>
         <w:tc>
@@ -1887,45 +1825,43 @@
           <w:sz w:val="20"/>
           <w:szCs w:val="20"/>
         </w:rPr>
-        <w:t>Byte order of signal value should be transmitted and received in the Motorola format (big endian format). The start bit of the signal starts from the least significant bit (</w:t>
-      </w:r>
-      <w:proofErr w:type="spellStart"/>
-      <w:r>
+        <w:t>Byte order of signal value should be transmitted and received in the Motorola format (big endian format). The start bit of the signal starts from the least significant bit (lsb) of the least significant byte (LSB).</w:t>
+      </w:r>
+    </w:p>
+    <w:p>
+      <w:pPr>
+        <w:pStyle w:val="BodyText"/>
+        <w:spacing w:before="11" w:line="281" w:lineRule="auto"/>
+        <w:ind w:left="0" w:firstLine="633"/>
         <w:rPr>
           <w:rFonts w:ascii="Arial" w:hAnsi="Arial" w:cs="Arial"/>
           <w:sz w:val="20"/>
           <w:szCs w:val="20"/>
         </w:rPr>
-        <w:t>lsb</w:t>
-      </w:r>
-      <w:proofErr w:type="spellEnd"/>
+      </w:pPr>
       <w:r>
         <w:rPr>
           <w:rFonts w:ascii="Arial" w:hAnsi="Arial" w:cs="Arial"/>
           <w:sz w:val="20"/>
           <w:szCs w:val="20"/>
         </w:rPr>
-        <w:t>) of the least significant byte (LSB).</w:t>
-      </w:r>
-    </w:p>
-    <w:p>
-      <w:pPr>
-        <w:pStyle w:val="BodyText"/>
-        <w:spacing w:before="11" w:line="281" w:lineRule="auto"/>
-        <w:ind w:left="0" w:firstLine="633"/>
+        <w:t>Example, a</w:t>
+      </w:r>
+      <w:r>
         <w:rPr>
           <w:rFonts w:ascii="Arial" w:hAnsi="Arial" w:cs="Arial"/>
           <w:sz w:val="20"/>
           <w:szCs w:val="20"/>
         </w:rPr>
-      </w:pPr>
+        <w:t xml:space="preserve">s shown in Figure </w:t>
+      </w:r>
       <w:r>
         <w:rPr>
           <w:rFonts w:ascii="Arial" w:hAnsi="Arial" w:cs="Arial"/>
           <w:sz w:val="20"/>
           <w:szCs w:val="20"/>
         </w:rPr>
-        <w:t>Example, a</w:t>
+        <w:t>1</w:t>
       </w:r>
       <w:r>
         <w:rPr>
@@ -1933,41 +1869,7 @@
           <w:sz w:val="20"/>
           <w:szCs w:val="20"/>
         </w:rPr>
-        <w:t xml:space="preserve">s shown in Figure </w:t>
-      </w:r>
-      <w:r>
-        <w:rPr>
-          <w:rFonts w:ascii="Arial" w:hAnsi="Arial" w:cs="Arial"/>
-          <w:sz w:val="20"/>
-          <w:szCs w:val="20"/>
-        </w:rPr>
-        <w:t>1</w:t>
-      </w:r>
-      <w:r>
-        <w:rPr>
-          <w:rFonts w:ascii="Arial" w:hAnsi="Arial" w:cs="Arial"/>
-          <w:sz w:val="20"/>
-          <w:szCs w:val="20"/>
-        </w:rPr>
-        <w:t xml:space="preserve">, a data field contains a 10-bit-signal message in the Motorola format, whose start bit is 28 </w:t>
-      </w:r>
-      <w:proofErr w:type="gramStart"/>
-      <w:r>
-        <w:rPr>
-          <w:rFonts w:ascii="Arial" w:hAnsi="Arial" w:cs="Arial"/>
-          <w:sz w:val="20"/>
-          <w:szCs w:val="20"/>
-        </w:rPr>
-        <w:t>bit</w:t>
-      </w:r>
-      <w:proofErr w:type="gramEnd"/>
-      <w:r>
-        <w:rPr>
-          <w:rFonts w:ascii="Arial" w:hAnsi="Arial" w:cs="Arial"/>
-          <w:sz w:val="20"/>
-          <w:szCs w:val="20"/>
-        </w:rPr>
-        <w:t>.</w:t>
+        <w:t>, a data field contains a 10-bit-signal message in the Motorola format, whose start bit is 28 bit.</w:t>
       </w:r>
     </w:p>
     <w:p>
@@ -2702,7 +2604,37 @@
           <w:sz w:val="22"/>
           <w:szCs w:val="22"/>
         </w:rPr>
-        <w:t xml:space="preserve">Node 2 </w:t>
+        <w:t>Node</w:t>
+      </w:r>
+      <w:r>
+        <w:rPr>
+          <w:rStyle w:val="eop"/>
+          <w:rFonts w:ascii="Calibri" w:eastAsiaTheme="majorEastAsia" w:hAnsi="Calibri" w:cs="Calibri"/>
+          <w:sz w:val="22"/>
+          <w:szCs w:val="22"/>
+          <w:lang w:val="vi-VN"/>
+        </w:rPr>
+        <w:t xml:space="preserve"> </w:t>
+      </w:r>
+      <w:bookmarkStart w:id="4" w:name="_GoBack"/>
+      <w:bookmarkEnd w:id="4"/>
+      <w:r>
+        <w:rPr>
+          <w:rStyle w:val="eop"/>
+          <w:rFonts w:ascii="Calibri" w:eastAsiaTheme="majorEastAsia" w:hAnsi="Calibri" w:cs="Calibri"/>
+          <w:sz w:val="22"/>
+          <w:szCs w:val="22"/>
+        </w:rPr>
+        <w:t>1</w:t>
+      </w:r>
+      <w:r>
+        <w:rPr>
+          <w:rStyle w:val="eop"/>
+          <w:rFonts w:ascii="Calibri" w:eastAsiaTheme="majorEastAsia" w:hAnsi="Calibri" w:cs="Calibri"/>
+          <w:sz w:val="22"/>
+          <w:szCs w:val="22"/>
+        </w:rPr>
+        <w:t xml:space="preserve"> </w:t>
       </w:r>
       <w:r>
         <w:rPr>
@@ -2858,10 +2790,135 @@
           <w:sz w:val="28"/>
           <w:szCs w:val="28"/>
         </w:rPr>
-        <w:t xml:space="preserve">Additional </w:t>
-      </w:r>
-      <w:proofErr w:type="gramStart"/>
-      <w:r>
+        <w:t>Additional requirement:</w:t>
+      </w:r>
+    </w:p>
+    <w:p>
+      <w:pPr>
+        <w:pStyle w:val="paragraph"/>
+        <w:textAlignment w:val="baseline"/>
+        <w:rPr>
+          <w:rStyle w:val="eop"/>
+          <w:rFonts w:ascii="Calibri" w:eastAsiaTheme="majorEastAsia" w:hAnsi="Calibri" w:cs="Calibri"/>
+          <w:sz w:val="22"/>
+          <w:szCs w:val="22"/>
+        </w:rPr>
+      </w:pPr>
+      <w:r>
+        <w:rPr>
+          <w:rStyle w:val="normaltextrun"/>
+          <w:rFonts w:ascii="Calibri" w:eastAsiaTheme="majorEastAsia" w:hAnsi="Calibri" w:cs="Calibri"/>
+          <w:sz w:val="22"/>
+          <w:szCs w:val="22"/>
+        </w:rPr>
+        <w:lastRenderedPageBreak/>
+        <w:t xml:space="preserve">CAN </w:t>
+      </w:r>
+      <w:r>
+        <w:rPr>
+          <w:rStyle w:val="normaltextrun"/>
+          <w:rFonts w:ascii="Calibri" w:eastAsiaTheme="majorEastAsia" w:hAnsi="Calibri" w:cs="Calibri"/>
+          <w:sz w:val="22"/>
+          <w:szCs w:val="22"/>
+        </w:rPr>
+        <w:t xml:space="preserve">Node </w:t>
+      </w:r>
+      <w:r>
+        <w:rPr>
+          <w:rStyle w:val="normaltextrun"/>
+          <w:rFonts w:ascii="Calibri" w:eastAsiaTheme="majorEastAsia" w:hAnsi="Calibri" w:cs="Calibri"/>
+          <w:sz w:val="22"/>
+          <w:szCs w:val="22"/>
+        </w:rPr>
+        <w:t>1</w:t>
+      </w:r>
+      <w:r>
+        <w:rPr>
+          <w:rStyle w:val="normaltextrun"/>
+          <w:rFonts w:ascii="Calibri" w:eastAsiaTheme="majorEastAsia" w:hAnsi="Calibri" w:cs="Calibri"/>
+          <w:sz w:val="22"/>
+          <w:szCs w:val="22"/>
+        </w:rPr>
+        <w:t xml:space="preserve"> can display on LCD to show receiving value</w:t>
+      </w:r>
+      <w:r>
+        <w:rPr>
+          <w:rStyle w:val="normaltextrun"/>
+          <w:rFonts w:ascii="Calibri" w:eastAsiaTheme="majorEastAsia" w:hAnsi="Calibri" w:cs="Calibri"/>
+          <w:sz w:val="22"/>
+          <w:szCs w:val="22"/>
+        </w:rPr>
+        <w:t>s</w:t>
+      </w:r>
+      <w:r>
+        <w:rPr>
+          <w:rStyle w:val="normaltextrun"/>
+          <w:rFonts w:ascii="Calibri" w:eastAsiaTheme="majorEastAsia" w:hAnsi="Calibri" w:cs="Calibri"/>
+          <w:sz w:val="22"/>
+          <w:szCs w:val="22"/>
+        </w:rPr>
+        <w:t xml:space="preserve"> of </w:t>
+      </w:r>
+      <w:r>
+        <w:rPr>
+          <w:rStyle w:val="normaltextrun"/>
+          <w:rFonts w:ascii="Calibri" w:eastAsiaTheme="majorEastAsia" w:hAnsi="Calibri" w:cs="Calibri"/>
+          <w:sz w:val="22"/>
+          <w:szCs w:val="22"/>
+        </w:rPr>
+        <w:t>0x0A2</w:t>
+      </w:r>
+    </w:p>
+    <w:p>
+      <w:pPr>
+        <w:pStyle w:val="paragraph"/>
+        <w:textAlignment w:val="baseline"/>
+        <w:rPr>
+          <w:rStyle w:val="normaltextrun"/>
+          <w:rFonts w:ascii="Calibri" w:eastAsiaTheme="majorEastAsia" w:hAnsi="Calibri" w:cs="Calibri"/>
+          <w:sz w:val="22"/>
+          <w:szCs w:val="22"/>
+        </w:rPr>
+      </w:pPr>
+      <w:r>
+        <w:rPr>
+          <w:rStyle w:val="normaltextrun"/>
+          <w:rFonts w:ascii="Calibri" w:eastAsiaTheme="majorEastAsia" w:hAnsi="Calibri" w:cs="Calibri"/>
+          <w:sz w:val="22"/>
+          <w:szCs w:val="22"/>
+        </w:rPr>
+        <w:t>CAN node 2 (</w:t>
+      </w:r>
+      <w:r>
+        <w:rPr>
+          <w:rFonts w:ascii="Arial" w:hAnsi="Arial" w:cs="Arial"/>
+          <w:sz w:val="20"/>
+          <w:szCs w:val="20"/>
+        </w:rPr>
+        <w:t>Verification board</w:t>
+      </w:r>
+      <w:r>
+        <w:rPr>
+          <w:rStyle w:val="normaltextrun"/>
+          <w:rFonts w:ascii="Calibri" w:eastAsiaTheme="majorEastAsia" w:hAnsi="Calibri" w:cs="Calibri"/>
+          <w:sz w:val="22"/>
+          <w:szCs w:val="22"/>
+        </w:rPr>
+        <w:t>) will acknowledge the receiving of 0x012 and valid CRC on LCD/LED.</w:t>
+      </w:r>
+    </w:p>
+    <w:p>
+      <w:pPr>
+        <w:pStyle w:val="paragraph"/>
+        <w:rPr>
+          <w:rStyle w:val="normaltextrun"/>
+        </w:rPr>
+      </w:pPr>
+    </w:p>
+    <w:p>
+      <w:pPr>
+        <w:pStyle w:val="paragraph"/>
+        <w:textAlignment w:val="baseline"/>
         <w:rPr>
           <w:rStyle w:val="normaltextrun"/>
           <w:rFonts w:ascii="Calibri" w:eastAsiaTheme="majorEastAsia" w:hAnsi="Calibri" w:cs="Calibri"/>
@@ -2869,9 +2926,7 @@
           <w:sz w:val="28"/>
           <w:szCs w:val="28"/>
         </w:rPr>
-        <w:t>requirement</w:t>
-      </w:r>
-      <w:proofErr w:type="gramEnd"/>
+      </w:pPr>
       <w:r>
         <w:rPr>
           <w:rStyle w:val="normaltextrun"/>
@@ -2880,7 +2935,7 @@
           <w:sz w:val="28"/>
           <w:szCs w:val="28"/>
         </w:rPr>
-        <w:t>:</w:t>
+        <w:t>Assessment:</w:t>
       </w:r>
     </w:p>
     <w:p>
@@ -2888,30 +2943,20 @@
         <w:pStyle w:val="paragraph"/>
         <w:textAlignment w:val="baseline"/>
         <w:rPr>
-          <w:rStyle w:val="eop"/>
-          <w:rFonts w:ascii="Calibri" w:eastAsiaTheme="majorEastAsia" w:hAnsi="Calibri" w:cs="Calibri"/>
-          <w:sz w:val="22"/>
-          <w:szCs w:val="22"/>
-        </w:rPr>
-      </w:pPr>
-      <w:r>
-        <w:rPr>
-          <w:rStyle w:val="normaltextrun"/>
-          <w:rFonts w:ascii="Calibri" w:eastAsiaTheme="majorEastAsia" w:hAnsi="Calibri" w:cs="Calibri"/>
-          <w:sz w:val="22"/>
-          <w:szCs w:val="22"/>
-        </w:rPr>
-        <w:lastRenderedPageBreak/>
-        <w:t xml:space="preserve">CAN </w:t>
-      </w:r>
-      <w:r>
-        <w:rPr>
-          <w:rStyle w:val="normaltextrun"/>
-          <w:rFonts w:ascii="Calibri" w:eastAsiaTheme="majorEastAsia" w:hAnsi="Calibri" w:cs="Calibri"/>
-          <w:sz w:val="22"/>
-          <w:szCs w:val="22"/>
-        </w:rPr>
-        <w:t xml:space="preserve">Node </w:t>
+          <w:rStyle w:val="normaltextrun"/>
+          <w:rFonts w:ascii="Calibri" w:eastAsiaTheme="majorEastAsia" w:hAnsi="Calibri" w:cs="Calibri"/>
+          <w:sz w:val="22"/>
+          <w:szCs w:val="22"/>
+        </w:rPr>
+      </w:pPr>
+      <w:r>
+        <w:rPr>
+          <w:rStyle w:val="normaltextrun"/>
+          <w:rFonts w:ascii="Calibri" w:eastAsiaTheme="majorEastAsia" w:hAnsi="Calibri" w:cs="Calibri"/>
+          <w:sz w:val="22"/>
+          <w:szCs w:val="22"/>
+        </w:rPr>
+        <w:t>Node 1 can send 0x012 (</w:t>
       </w:r>
       <w:r>
         <w:rPr>
@@ -2929,34 +2974,7 @@
           <w:sz w:val="22"/>
           <w:szCs w:val="22"/>
         </w:rPr>
-        <w:t xml:space="preserve"> can display on LCD to show receiving value</w:t>
-      </w:r>
-      <w:r>
-        <w:rPr>
-          <w:rStyle w:val="normaltextrun"/>
-          <w:rFonts w:ascii="Calibri" w:eastAsiaTheme="majorEastAsia" w:hAnsi="Calibri" w:cs="Calibri"/>
-          <w:sz w:val="22"/>
-          <w:szCs w:val="22"/>
-        </w:rPr>
-        <w:t>s</w:t>
-      </w:r>
-      <w:r>
-        <w:rPr>
-          <w:rStyle w:val="normaltextrun"/>
-          <w:rFonts w:ascii="Calibri" w:eastAsiaTheme="majorEastAsia" w:hAnsi="Calibri" w:cs="Calibri"/>
-          <w:sz w:val="22"/>
-          <w:szCs w:val="22"/>
-        </w:rPr>
-        <w:t xml:space="preserve"> of </w:t>
-      </w:r>
-      <w:r>
-        <w:rPr>
-          <w:rStyle w:val="normaltextrun"/>
-          <w:rFonts w:ascii="Calibri" w:eastAsiaTheme="majorEastAsia" w:hAnsi="Calibri" w:cs="Calibri"/>
-          <w:sz w:val="22"/>
-          <w:szCs w:val="22"/>
-        </w:rPr>
-        <w:t>0x0A2</w:t>
+        <w:t xml:space="preserve"> point)</w:t>
       </w:r>
     </w:p>
     <w:p>
@@ -2977,33 +2995,35 @@
           <w:sz w:val="22"/>
           <w:szCs w:val="22"/>
         </w:rPr>
-        <w:t>CAN node 2 (</w:t>
-      </w:r>
-      <w:r>
-        <w:rPr>
-          <w:rFonts w:ascii="Arial" w:hAnsi="Arial" w:cs="Arial"/>
-          <w:sz w:val="20"/>
-          <w:szCs w:val="20"/>
-        </w:rPr>
-        <w:t>Verification board</w:t>
-      </w:r>
-      <w:r>
-        <w:rPr>
-          <w:rStyle w:val="normaltextrun"/>
-          <w:rFonts w:ascii="Calibri" w:eastAsiaTheme="majorEastAsia" w:hAnsi="Calibri" w:cs="Calibri"/>
-          <w:sz w:val="22"/>
-          <w:szCs w:val="22"/>
-        </w:rPr>
-        <w:t>) will acknowledge the receiving of 0x012 and valid CRC on LCD/LED.</w:t>
-      </w:r>
-    </w:p>
-    <w:p>
-      <w:pPr>
-        <w:pStyle w:val="paragraph"/>
-        <w:rPr>
-          <w:rStyle w:val="normaltextrun"/>
-        </w:rPr>
-      </w:pPr>
+        <w:t>Node 1 can send 0x012 on time (+- 1 millisecond)</w:t>
+      </w:r>
+      <w:r>
+        <w:rPr>
+          <w:rStyle w:val="normaltextrun"/>
+          <w:rFonts w:ascii="Calibri" w:eastAsiaTheme="majorEastAsia" w:hAnsi="Calibri" w:cs="Calibri"/>
+          <w:sz w:val="22"/>
+          <w:szCs w:val="22"/>
+        </w:rPr>
+        <w:t xml:space="preserve"> (</w:t>
+      </w:r>
+      <w:r>
+        <w:rPr>
+          <w:rStyle w:val="normaltextrun"/>
+          <w:rFonts w:ascii="Calibri" w:eastAsiaTheme="majorEastAsia" w:hAnsi="Calibri" w:cs="Calibri"/>
+          <w:sz w:val="22"/>
+          <w:szCs w:val="22"/>
+        </w:rPr>
+        <w:t>1</w:t>
+      </w:r>
+      <w:r>
+        <w:rPr>
+          <w:rStyle w:val="normaltextrun"/>
+          <w:rFonts w:ascii="Calibri" w:eastAsiaTheme="majorEastAsia" w:hAnsi="Calibri" w:cs="Calibri"/>
+          <w:sz w:val="22"/>
+          <w:szCs w:val="22"/>
+        </w:rPr>
+        <w:t xml:space="preserve"> point)</w:t>
+      </w:r>
     </w:p>
     <w:p>
       <w:pPr>
@@ -3012,20 +3032,36 @@
         <w:rPr>
           <w:rStyle w:val="normaltextrun"/>
           <w:rFonts w:ascii="Calibri" w:eastAsiaTheme="majorEastAsia" w:hAnsi="Calibri" w:cs="Calibri"/>
-          <w:color w:val="0070C0"/>
-          <w:sz w:val="28"/>
-          <w:szCs w:val="28"/>
-        </w:rPr>
-      </w:pPr>
-      <w:r>
-        <w:rPr>
-          <w:rStyle w:val="normaltextrun"/>
-          <w:rFonts w:ascii="Calibri" w:eastAsiaTheme="majorEastAsia" w:hAnsi="Calibri" w:cs="Calibri"/>
-          <w:color w:val="0070C0"/>
-          <w:sz w:val="28"/>
-          <w:szCs w:val="28"/>
-        </w:rPr>
-        <w:t>Assessment:</w:t>
+          <w:sz w:val="22"/>
+          <w:szCs w:val="22"/>
+        </w:rPr>
+      </w:pPr>
+      <w:r>
+        <w:rPr>
+          <w:rStyle w:val="normaltextrun"/>
+          <w:rFonts w:ascii="Calibri" w:eastAsiaTheme="majorEastAsia" w:hAnsi="Calibri" w:cs="Calibri"/>
+          <w:sz w:val="22"/>
+          <w:szCs w:val="22"/>
+        </w:rPr>
+        <w:t xml:space="preserve">Node 1 can send correct data in byte </w:t>
+      </w:r>
+      <w:r>
+        <w:rPr>
+          <w:rStyle w:val="normaltextrun"/>
+          <w:rFonts w:ascii="Calibri" w:eastAsiaTheme="majorEastAsia" w:hAnsi="Calibri" w:cs="Calibri"/>
+          <w:sz w:val="22"/>
+          <w:szCs w:val="22"/>
+        </w:rPr>
+        <w:t>0, 1</w:t>
+      </w:r>
+      <w:r>
+        <w:rPr>
+          <w:rStyle w:val="normaltextrun"/>
+          <w:rFonts w:ascii="Calibri" w:eastAsiaTheme="majorEastAsia" w:hAnsi="Calibri" w:cs="Calibri"/>
+          <w:sz w:val="22"/>
+          <w:szCs w:val="22"/>
+        </w:rPr>
+        <w:t xml:space="preserve"> (1 point)</w:t>
       </w:r>
     </w:p>
     <w:p>
@@ -3046,25 +3082,7 @@
           <w:sz w:val="22"/>
           <w:szCs w:val="22"/>
         </w:rPr>
-        <w:t>Node 1 can send 0x012 (</w:t>
-      </w:r>
-      <w:r>
-        <w:rPr>
-          <w:rStyle w:val="normaltextrun"/>
-          <w:rFonts w:ascii="Calibri" w:eastAsiaTheme="majorEastAsia" w:hAnsi="Calibri" w:cs="Calibri"/>
-          <w:sz w:val="22"/>
-          <w:szCs w:val="22"/>
-        </w:rPr>
-        <w:t>1</w:t>
-      </w:r>
-      <w:r>
-        <w:rPr>
-          <w:rStyle w:val="normaltextrun"/>
-          <w:rFonts w:ascii="Calibri" w:eastAsiaTheme="majorEastAsia" w:hAnsi="Calibri" w:cs="Calibri"/>
-          <w:sz w:val="22"/>
-          <w:szCs w:val="22"/>
-        </w:rPr>
-        <w:t xml:space="preserve"> point)</w:t>
+        <w:t>Node 1 can send correct data in byte 2 (1 point)</w:t>
       </w:r>
     </w:p>
     <w:p>
@@ -3076,16 +3094,26 @@
           <w:rFonts w:ascii="Calibri" w:eastAsiaTheme="majorEastAsia" w:hAnsi="Calibri" w:cs="Calibri"/>
           <w:sz w:val="22"/>
           <w:szCs w:val="22"/>
-        </w:rPr>
-      </w:pPr>
-      <w:r>
-        <w:rPr>
-          <w:rStyle w:val="normaltextrun"/>
-          <w:rFonts w:ascii="Calibri" w:eastAsiaTheme="majorEastAsia" w:hAnsi="Calibri" w:cs="Calibri"/>
-          <w:sz w:val="22"/>
-          <w:szCs w:val="22"/>
-        </w:rPr>
-        <w:t>Node 1 can send 0x012 on time (+- 1 millisecond)</w:t>
+          <w:lang w:val="vi-VN"/>
+        </w:rPr>
+      </w:pPr>
+      <w:r>
+        <w:rPr>
+          <w:rStyle w:val="normaltextrun"/>
+          <w:rFonts w:ascii="Calibri" w:eastAsiaTheme="majorEastAsia" w:hAnsi="Calibri" w:cs="Calibri"/>
+          <w:sz w:val="22"/>
+          <w:szCs w:val="22"/>
+        </w:rPr>
+        <w:t xml:space="preserve">Node 1 can send correct checksum in byte </w:t>
+      </w:r>
+      <w:r>
+        <w:rPr>
+          <w:rStyle w:val="normaltextrun"/>
+          <w:rFonts w:ascii="Calibri" w:eastAsiaTheme="majorEastAsia" w:hAnsi="Calibri" w:cs="Calibri"/>
+          <w:sz w:val="22"/>
+          <w:szCs w:val="22"/>
+        </w:rPr>
+        <w:t>7</w:t>
       </w:r>
       <w:r>
         <w:rPr>
@@ -3124,34 +3152,29 @@
           <w:rFonts w:ascii="Calibri" w:eastAsiaTheme="majorEastAsia" w:hAnsi="Calibri" w:cs="Calibri"/>
           <w:sz w:val="22"/>
           <w:szCs w:val="22"/>
-        </w:rPr>
-      </w:pPr>
-      <w:r>
-        <w:rPr>
-          <w:rStyle w:val="normaltextrun"/>
-          <w:rFonts w:ascii="Calibri" w:eastAsiaTheme="majorEastAsia" w:hAnsi="Calibri" w:cs="Calibri"/>
-          <w:sz w:val="22"/>
-          <w:szCs w:val="22"/>
-        </w:rPr>
-        <w:t xml:space="preserve">Node 1 can send correct data in byte </w:t>
-      </w:r>
-      <w:r>
-        <w:rPr>
-          <w:rStyle w:val="normaltextrun"/>
-          <w:rFonts w:ascii="Calibri" w:eastAsiaTheme="majorEastAsia" w:hAnsi="Calibri" w:cs="Calibri"/>
-          <w:sz w:val="22"/>
-          <w:szCs w:val="22"/>
-        </w:rPr>
-        <w:t>0, 1</w:t>
-      </w:r>
-      <w:r>
-        <w:rPr>
-          <w:rStyle w:val="normaltextrun"/>
-          <w:rFonts w:ascii="Calibri" w:eastAsiaTheme="majorEastAsia" w:hAnsi="Calibri" w:cs="Calibri"/>
-          <w:sz w:val="22"/>
-          <w:szCs w:val="22"/>
-        </w:rPr>
-        <w:t xml:space="preserve"> (1 point)</w:t>
+          <w:lang w:val="vi-VN"/>
+        </w:rPr>
+      </w:pPr>
+      <w:r>
+        <w:rPr>
+          <w:rStyle w:val="normaltextrun"/>
+          <w:rFonts w:ascii="Calibri" w:eastAsiaTheme="majorEastAsia" w:hAnsi="Calibri" w:cs="Calibri"/>
+          <w:sz w:val="22"/>
+          <w:szCs w:val="22"/>
+          <w:highlight w:val="yellow"/>
+        </w:rPr>
+        <w:t>Node 1 can display the value via</w:t>
+      </w:r>
+      <w:r>
+        <w:rPr>
+          <w:rStyle w:val="normaltextrun"/>
+          <w:rFonts w:ascii="Calibri" w:eastAsiaTheme="majorEastAsia" w:hAnsi="Calibri" w:cs="Calibri"/>
+          <w:sz w:val="22"/>
+          <w:szCs w:val="22"/>
+          <w:highlight w:val="yellow"/>
+          <w:lang w:val="vi-VN"/>
+        </w:rPr>
+        <w:t xml:space="preserve"> UART and display in the computer (2 point)</w:t>
       </w:r>
     </w:p>
     <w:p>
@@ -3163,16 +3186,19 @@
           <w:rFonts w:ascii="Calibri" w:eastAsiaTheme="majorEastAsia" w:hAnsi="Calibri" w:cs="Calibri"/>
           <w:sz w:val="22"/>
           <w:szCs w:val="22"/>
-        </w:rPr>
-      </w:pPr>
-      <w:r>
-        <w:rPr>
-          <w:rStyle w:val="normaltextrun"/>
-          <w:rFonts w:ascii="Calibri" w:eastAsiaTheme="majorEastAsia" w:hAnsi="Calibri" w:cs="Calibri"/>
-          <w:sz w:val="22"/>
-          <w:szCs w:val="22"/>
-        </w:rPr>
-        <w:t>Node 1 can send correct data in byte 2 (1 point)</w:t>
+          <w:lang w:val="vi-VN"/>
+        </w:rPr>
+      </w:pPr>
+      <w:r>
+        <w:rPr>
+          <w:rStyle w:val="normaltextrun"/>
+          <w:rFonts w:ascii="Calibri" w:eastAsiaTheme="majorEastAsia" w:hAnsi="Calibri" w:cs="Calibri"/>
+          <w:sz w:val="22"/>
+          <w:szCs w:val="22"/>
+          <w:highlight w:val="yellow"/>
+          <w:lang w:val="vi-VN"/>
+        </w:rPr>
+        <w:t>The student can answer all the question (2 point)</w:t>
       </w:r>
     </w:p>
     <w:p>
@@ -3180,7 +3206,6 @@
         <w:pStyle w:val="paragraph"/>
         <w:textAlignment w:val="baseline"/>
         <w:rPr>
-          <w:rStyle w:val="normaltextrun"/>
           <w:rFonts w:ascii="Calibri" w:eastAsiaTheme="majorEastAsia" w:hAnsi="Calibri" w:cs="Calibri"/>
           <w:sz w:val="22"/>
           <w:szCs w:val="22"/>
@@ -3194,49 +3219,18 @@
           <w:sz w:val="22"/>
           <w:szCs w:val="22"/>
         </w:rPr>
-        <w:t xml:space="preserve">Node 1 can send correct checksum in byte </w:t>
-      </w:r>
-      <w:r>
-        <w:rPr>
-          <w:rStyle w:val="normaltextrun"/>
-          <w:rFonts w:ascii="Calibri" w:eastAsiaTheme="majorEastAsia" w:hAnsi="Calibri" w:cs="Calibri"/>
-          <w:sz w:val="22"/>
-          <w:szCs w:val="22"/>
-        </w:rPr>
-        <w:t>7</w:t>
-      </w:r>
-      <w:r>
-        <w:rPr>
-          <w:rStyle w:val="normaltextrun"/>
-          <w:rFonts w:ascii="Calibri" w:eastAsiaTheme="majorEastAsia" w:hAnsi="Calibri" w:cs="Calibri"/>
-          <w:sz w:val="22"/>
-          <w:szCs w:val="22"/>
-        </w:rPr>
-        <w:t xml:space="preserve"> (</w:t>
-      </w:r>
-      <w:r>
-        <w:rPr>
-          <w:rStyle w:val="normaltextrun"/>
-          <w:rFonts w:ascii="Calibri" w:eastAsiaTheme="majorEastAsia" w:hAnsi="Calibri" w:cs="Calibri"/>
-          <w:sz w:val="22"/>
-          <w:szCs w:val="22"/>
-        </w:rPr>
-        <w:t>1</w:t>
-      </w:r>
-      <w:r>
-        <w:rPr>
-          <w:rStyle w:val="normaltextrun"/>
-          <w:rFonts w:ascii="Calibri" w:eastAsiaTheme="majorEastAsia" w:hAnsi="Calibri" w:cs="Calibri"/>
-          <w:sz w:val="22"/>
-          <w:szCs w:val="22"/>
-        </w:rPr>
-        <w:t xml:space="preserve"> point)</w:t>
-      </w:r>
-    </w:p>
-    <w:p>
-      <w:pPr>
-        <w:pStyle w:val="paragraph"/>
-        <w:textAlignment w:val="baseline"/>
+        <w:t>LCD can display the log recording</w:t>
+      </w:r>
+      <w:r>
+        <w:rPr>
+          <w:rStyle w:val="normaltextrun"/>
+          <w:rFonts w:ascii="Calibri" w:eastAsiaTheme="majorEastAsia" w:hAnsi="Calibri" w:cs="Calibri"/>
+          <w:sz w:val="22"/>
+          <w:szCs w:val="22"/>
+        </w:rPr>
+        <w:t xml:space="preserve"> (1 point)</w:t>
+      </w:r>
+      <w:r>
         <w:rPr>
           <w:rStyle w:val="normaltextrun"/>
           <w:rFonts w:ascii="Calibri" w:eastAsiaTheme="majorEastAsia" w:hAnsi="Calibri" w:cs="Calibri"/>
@@ -3244,7 +3238,8 @@
           <w:szCs w:val="22"/>
           <w:lang w:val="vi-VN"/>
         </w:rPr>
-      </w:pPr>
+        <w:t xml:space="preserve"> – </w:t>
+      </w:r>
       <w:r>
         <w:rPr>
           <w:rStyle w:val="normaltextrun"/>
@@ -3253,195 +3248,7 @@
           <w:szCs w:val="22"/>
           <w:highlight w:val="yellow"/>
         </w:rPr>
-        <w:t xml:space="preserve">Node 1 can display the </w:t>
-      </w:r>
-      <w:r>
-        <w:rPr>
-          <w:rStyle w:val="normaltextrun"/>
-          <w:rFonts w:ascii="Calibri" w:eastAsiaTheme="majorEastAsia" w:hAnsi="Calibri" w:cs="Calibri"/>
-          <w:sz w:val="22"/>
-          <w:szCs w:val="22"/>
-          <w:highlight w:val="yellow"/>
-        </w:rPr>
-        <w:t>value v</w:t>
-      </w:r>
-      <w:r>
-        <w:rPr>
-          <w:rStyle w:val="normaltextrun"/>
-          <w:rFonts w:ascii="Calibri" w:eastAsiaTheme="majorEastAsia" w:hAnsi="Calibri" w:cs="Calibri"/>
-          <w:sz w:val="22"/>
-          <w:szCs w:val="22"/>
-          <w:highlight w:val="yellow"/>
-        </w:rPr>
-        <w:t>ia</w:t>
-      </w:r>
-      <w:r>
-        <w:rPr>
-          <w:rStyle w:val="normaltextrun"/>
-          <w:rFonts w:ascii="Calibri" w:eastAsiaTheme="majorEastAsia" w:hAnsi="Calibri" w:cs="Calibri"/>
-          <w:sz w:val="22"/>
-          <w:szCs w:val="22"/>
-          <w:highlight w:val="yellow"/>
-          <w:lang w:val="vi-VN"/>
-        </w:rPr>
-        <w:t xml:space="preserve"> UART and display in the computer</w:t>
-      </w:r>
-      <w:r>
-        <w:rPr>
-          <w:rStyle w:val="normaltextrun"/>
-          <w:rFonts w:ascii="Calibri" w:eastAsiaTheme="majorEastAsia" w:hAnsi="Calibri" w:cs="Calibri"/>
-          <w:sz w:val="22"/>
-          <w:szCs w:val="22"/>
-          <w:highlight w:val="yellow"/>
-          <w:lang w:val="vi-VN"/>
-        </w:rPr>
-        <w:t xml:space="preserve"> (2 point)</w:t>
-      </w:r>
-    </w:p>
-    <w:p>
-      <w:pPr>
-        <w:pStyle w:val="paragraph"/>
-        <w:textAlignment w:val="baseline"/>
-        <w:rPr>
-          <w:rStyle w:val="normaltextrun"/>
-          <w:rFonts w:ascii="Calibri" w:eastAsiaTheme="majorEastAsia" w:hAnsi="Calibri" w:cs="Calibri"/>
-          <w:sz w:val="22"/>
-          <w:szCs w:val="22"/>
-          <w:lang w:val="vi-VN"/>
-        </w:rPr>
-      </w:pPr>
-      <w:r>
-        <w:rPr>
-          <w:rStyle w:val="normaltextrun"/>
-          <w:rFonts w:ascii="Calibri" w:eastAsiaTheme="majorEastAsia" w:hAnsi="Calibri" w:cs="Calibri"/>
-          <w:sz w:val="22"/>
-          <w:szCs w:val="22"/>
-          <w:highlight w:val="yellow"/>
-          <w:lang w:val="vi-VN"/>
-        </w:rPr>
-        <w:t>The student can answer all the question (2 point)</w:t>
-      </w:r>
-    </w:p>
-    <w:p>
-      <w:pPr>
-        <w:pStyle w:val="paragraph"/>
-        <w:textAlignment w:val="baseline"/>
-        <w:rPr>
-          <w:rFonts w:ascii="Calibri" w:eastAsiaTheme="majorEastAsia" w:hAnsi="Calibri" w:cs="Calibri"/>
-          <w:sz w:val="22"/>
-          <w:szCs w:val="22"/>
-          <w:lang w:val="vi-VN"/>
-        </w:rPr>
-      </w:pPr>
-      <w:r>
-        <w:rPr>
-          <w:rStyle w:val="normaltextrun"/>
-          <w:rFonts w:ascii="Calibri" w:eastAsiaTheme="majorEastAsia" w:hAnsi="Calibri" w:cs="Calibri"/>
-          <w:sz w:val="22"/>
-          <w:szCs w:val="22"/>
-        </w:rPr>
-        <w:t>LCD can display the log recording</w:t>
-      </w:r>
-      <w:r>
-        <w:rPr>
-          <w:rStyle w:val="normaltextrun"/>
-          <w:rFonts w:ascii="Calibri" w:eastAsiaTheme="majorEastAsia" w:hAnsi="Calibri" w:cs="Calibri"/>
-          <w:sz w:val="22"/>
-          <w:szCs w:val="22"/>
-        </w:rPr>
-        <w:t xml:space="preserve"> (1 point)</w:t>
-      </w:r>
-      <w:r>
-        <w:rPr>
-          <w:rStyle w:val="normaltextrun"/>
-          <w:rFonts w:ascii="Calibri" w:eastAsiaTheme="majorEastAsia" w:hAnsi="Calibri" w:cs="Calibri"/>
-          <w:sz w:val="22"/>
-          <w:szCs w:val="22"/>
-          <w:lang w:val="vi-VN"/>
-        </w:rPr>
-        <w:t xml:space="preserve"> – </w:t>
-      </w:r>
-      <w:r>
-        <w:rPr>
-          <w:rStyle w:val="normaltextrun"/>
-          <w:rFonts w:ascii="Calibri" w:eastAsiaTheme="majorEastAsia" w:hAnsi="Calibri" w:cs="Calibri"/>
-          <w:sz w:val="22"/>
-          <w:szCs w:val="22"/>
-          <w:highlight w:val="yellow"/>
-        </w:rPr>
-        <w:t xml:space="preserve">Watch out: </w:t>
-      </w:r>
-      <w:r>
-        <w:rPr>
-          <w:rStyle w:val="normaltextrun"/>
-          <w:rFonts w:ascii="Calibri" w:eastAsiaTheme="majorEastAsia" w:hAnsi="Calibri" w:cs="Calibri"/>
-          <w:sz w:val="22"/>
-          <w:szCs w:val="22"/>
-          <w:highlight w:val="yellow"/>
-        </w:rPr>
-        <w:t>Allow to r</w:t>
-      </w:r>
-      <w:r>
-        <w:rPr>
-          <w:rStyle w:val="normaltextrun"/>
-          <w:rFonts w:ascii="Calibri" w:eastAsiaTheme="majorEastAsia" w:hAnsi="Calibri" w:cs="Calibri"/>
-          <w:sz w:val="22"/>
-          <w:szCs w:val="22"/>
-          <w:highlight w:val="yellow"/>
-        </w:rPr>
-        <w:t>e-</w:t>
-      </w:r>
-      <w:proofErr w:type="spellStart"/>
-      <w:r>
-        <w:rPr>
-          <w:rStyle w:val="normaltextrun"/>
-          <w:rFonts w:ascii="Calibri" w:eastAsiaTheme="majorEastAsia" w:hAnsi="Calibri" w:cs="Calibri"/>
-          <w:sz w:val="22"/>
-          <w:szCs w:val="22"/>
-          <w:highlight w:val="yellow"/>
-        </w:rPr>
-        <w:t>init</w:t>
-      </w:r>
-      <w:proofErr w:type="spellEnd"/>
-      <w:r>
-        <w:rPr>
-          <w:rStyle w:val="normaltextrun"/>
-          <w:rFonts w:ascii="Calibri" w:eastAsiaTheme="majorEastAsia" w:hAnsi="Calibri" w:cs="Calibri"/>
-          <w:sz w:val="22"/>
-          <w:szCs w:val="22"/>
-          <w:highlight w:val="yellow"/>
-        </w:rPr>
-        <w:t xml:space="preserve"> GPIO to switch between CAN transceiver and LCD</w:t>
-      </w:r>
-      <w:r>
-        <w:rPr>
-          <w:rStyle w:val="normaltextrun"/>
-          <w:rFonts w:ascii="Calibri" w:eastAsiaTheme="majorEastAsia" w:hAnsi="Calibri" w:cs="Calibri"/>
-          <w:sz w:val="22"/>
-          <w:szCs w:val="22"/>
-          <w:highlight w:val="yellow"/>
-        </w:rPr>
-        <w:t xml:space="preserve"> green</w:t>
-      </w:r>
-      <w:r>
-        <w:rPr>
-          <w:rStyle w:val="normaltextrun"/>
-          <w:rFonts w:ascii="Calibri" w:eastAsiaTheme="majorEastAsia" w:hAnsi="Calibri" w:cs="Calibri"/>
-          <w:sz w:val="22"/>
-          <w:szCs w:val="22"/>
-          <w:highlight w:val="yellow"/>
-        </w:rPr>
-        <w:t xml:space="preserve"> connection to STM32</w:t>
-      </w:r>
-      <w:r>
-        <w:rPr>
-          <w:rStyle w:val="normaltextrun"/>
-          <w:rFonts w:ascii="Calibri" w:eastAsiaTheme="majorEastAsia" w:hAnsi="Calibri" w:cs="Calibri"/>
-          <w:sz w:val="22"/>
-          <w:szCs w:val="22"/>
-          <w:highlight w:val="yellow"/>
-        </w:rPr>
-        <w:t>.</w:t>
+        <w:t>Watch out: Allow to re-init GPIO to switch between CAN transceiver and LCD green connection to STM32.</w:t>
       </w:r>
     </w:p>
     <w:sectPr>
@@ -3455,7 +3262,7 @@
 </file>
 
 <file path=word/numbering.xml><?xml version="1.0" encoding="utf-8"?>
-<w:numbering xmlns:wpc="http://schemas.microsoft.com/office/word/2010/wordprocessingCanvas" xmlns:cx="http://schemas.microsoft.com/office/drawing/2014/chartex" xmlns:cx1="http://schemas.microsoft.com/office/drawing/2015/9/8/chartex" xmlns:cx2="http://schemas.microsoft.com/office/drawing/2015/10/21/chartex" xmlns:cx3="http://schemas.microsoft.com/office/drawing/2016/5/9/chartex" xmlns:cx4="http://schemas.microsoft.com/office/drawing/2016/5/10/chartex" xmlns:cx5="http://schemas.microsoft.com/office/drawing/2016/5/11/chartex" xmlns:cx6="http://schemas.microsoft.com/office/drawing/2016/5/12/chartex" xmlns:cx7="http://schemas.microsoft.com/office/drawing/2016/5/13/chartex" xmlns:cx8="http://schemas.microsoft.com/office/drawing/2016/5/14/chartex" xmlns:mc="http://schemas.openxmlformats.org/markup-compatibility/2006" xmlns:aink="http://schemas.microsoft.com/office/drawing/2016/ink" xmlns:am3d="http://schemas.microsoft.com/office/drawing/2017/model3d" xmlns:o="urn:schemas-microsoft-com:office:office" xmlns:oel="http://schemas.microsoft.com/office/2019/extlst" xmlns:r="http://schemas.openxmlformats.org/officeDocument/2006/relationships" xmlns:m="http://schemas.openxmlformats.org/officeDocument/2006/math" xmlns:v="urn:schemas-microsoft-com:vml" xmlns:wp14="http://schemas.microsoft.com/office/word/2010/wordprocessingDrawing" xmlns:wp="http://schemas.openxmlformats.org/drawingml/2006/wordprocessingDrawing" xmlns:w10="urn:schemas-microsoft-com:office:word" xmlns:w="http://schemas.openxmlformats.org/wordprocessingml/2006/main" xmlns:w14="http://schemas.microsoft.com/office/word/2010/wordml" xmlns:w15="http://schemas.microsoft.com/office/word/2012/wordml" xmlns:w16cei="http://schemas.microsoft.com/office/word/2026/wordml/cei" xmlns:w16cex="http://schemas.microsoft.com/office/word/2018/wordml/cex" xmlns:w16cid="http://schemas.microsoft.com/office/word/2016/wordml/cid" xmlns:w16="http://schemas.microsoft.com/office/word/2018/wordml" xmlns:w16du="http://schemas.microsoft.com/office/word/2023/wordml/word16du" xmlns:w16sdtdh="http://schemas.microsoft.com/office/word/2020/wordml/sdtdatahash" xmlns:w16sdtfl="http://schemas.microsoft.com/office/word/2024/wordml/sdtformatlock" xmlns:w16se="http://schemas.microsoft.com/office/word/2015/wordml/symex" xmlns:wpg="http://schemas.microsoft.com/office/word/2010/wordprocessingGroup" xmlns:wpi="http://schemas.microsoft.com/office/word/2010/wordprocessingInk" xmlns:wne="http://schemas.microsoft.com/office/word/2006/wordml" xmlns:wps="http://schemas.microsoft.com/office/word/2010/wordprocessingShape" mc:Ignorable="w14 w15 w16se w16cid w16 w16cex w16sdtdh w16sdtfl w16du wp14">
+<w:numbering xmlns:wpc="http://schemas.microsoft.com/office/word/2010/wordprocessingCanvas" xmlns:cx="http://schemas.microsoft.com/office/drawing/2014/chartex" xmlns:cx1="http://schemas.microsoft.com/office/drawing/2015/9/8/chartex" xmlns:cx2="http://schemas.microsoft.com/office/drawing/2015/10/21/chartex" xmlns:cx3="http://schemas.microsoft.com/office/drawing/2016/5/9/chartex" xmlns:cx4="http://schemas.microsoft.com/office/drawing/2016/5/10/chartex" xmlns:cx5="http://schemas.microsoft.com/office/drawing/2016/5/11/chartex" xmlns:cx6="http://schemas.microsoft.com/office/drawing/2016/5/12/chartex" xmlns:cx7="http://schemas.microsoft.com/office/drawing/2016/5/13/chartex" xmlns:cx8="http://schemas.microsoft.com/office/drawing/2016/5/14/chartex" xmlns:mc="http://schemas.openxmlformats.org/markup-compatibility/2006" xmlns:aink="http://schemas.microsoft.com/office/drawing/2016/ink" xmlns:am3d="http://schemas.microsoft.com/office/drawing/2017/model3d" xmlns:o="urn:schemas-microsoft-com:office:office" xmlns:r="http://schemas.openxmlformats.org/officeDocument/2006/relationships" xmlns:m="http://schemas.openxmlformats.org/officeDocument/2006/math" xmlns:v="urn:schemas-microsoft-com:vml" xmlns:wp14="http://schemas.microsoft.com/office/word/2010/wordprocessingDrawing" xmlns:wp="http://schemas.openxmlformats.org/drawingml/2006/wordprocessingDrawing" xmlns:w10="urn:schemas-microsoft-com:office:word" xmlns:w="http://schemas.openxmlformats.org/wordprocessingml/2006/main" xmlns:w14="http://schemas.microsoft.com/office/word/2010/wordml" xmlns:w15="http://schemas.microsoft.com/office/word/2012/wordml" xmlns:w16cid="http://schemas.microsoft.com/office/word/2016/wordml/cid" xmlns:w16se="http://schemas.microsoft.com/office/word/2015/wordml/symex" xmlns:wpg="http://schemas.microsoft.com/office/word/2010/wordprocessingGroup" xmlns:wpi="http://schemas.microsoft.com/office/word/2010/wordprocessingInk" xmlns:wne="http://schemas.microsoft.com/office/word/2006/wordml" xmlns:wps="http://schemas.microsoft.com/office/word/2010/wordprocessingShape" mc:Ignorable="w14 w15 w16se w16cid wp14">
   <w:abstractNum w:abstractNumId="0" w15:restartNumberingAfterBreak="0">
     <w:nsid w:val="0E61B085"/>
     <w:multiLevelType w:val="hybridMultilevel"/>
@@ -3965,26 +3772,26 @@
       </w:rPr>
     </w:lvl>
   </w:abstractNum>
-  <w:num w:numId="1" w16cid:durableId="190265502">
+  <w:num w:numId="1">
     <w:abstractNumId w:val="0"/>
   </w:num>
-  <w:num w:numId="2" w16cid:durableId="198052793">
+  <w:num w:numId="2">
     <w:abstractNumId w:val="2"/>
   </w:num>
-  <w:num w:numId="3" w16cid:durableId="1158613772">
+  <w:num w:numId="3">
     <w:abstractNumId w:val="4"/>
   </w:num>
-  <w:num w:numId="4" w16cid:durableId="1511489483">
+  <w:num w:numId="4">
     <w:abstractNumId w:val="3"/>
   </w:num>
-  <w:num w:numId="5" w16cid:durableId="911695285">
+  <w:num w:numId="5">
     <w:abstractNumId w:val="1"/>
   </w:num>
 </w:numbering>
 </file>
 
 <file path=word/styles.xml><?xml version="1.0" encoding="utf-8"?>
-<w:styles xmlns:mc="http://schemas.openxmlformats.org/markup-compatibility/2006" xmlns:r="http://schemas.openxmlformats.org/officeDocument/2006/relationships" xmlns:w="http://schemas.openxmlformats.org/wordprocessingml/2006/main" xmlns:w14="http://schemas.microsoft.com/office/word/2010/wordml" xmlns:w15="http://schemas.microsoft.com/office/word/2012/wordml" xmlns:w16cex="http://schemas.microsoft.com/office/word/2018/wordml/cex" xmlns:w16cid="http://schemas.microsoft.com/office/word/2016/wordml/cid" xmlns:w16="http://schemas.microsoft.com/office/word/2018/wordml" xmlns:w16du="http://schemas.microsoft.com/office/word/2023/wordml/word16du" xmlns:w16sdtdh="http://schemas.microsoft.com/office/word/2020/wordml/sdtdatahash" xmlns:w16sdtfl="http://schemas.microsoft.com/office/word/2024/wordml/sdtformatlock" xmlns:w16se="http://schemas.microsoft.com/office/word/2015/wordml/symex" mc:Ignorable="w14 w15 w16se w16cid w16 w16cex w16sdtdh w16sdtfl w16du">
+<w:styles xmlns:mc="http://schemas.openxmlformats.org/markup-compatibility/2006" xmlns:r="http://schemas.openxmlformats.org/officeDocument/2006/relationships" xmlns:w="http://schemas.openxmlformats.org/wordprocessingml/2006/main" xmlns:w14="http://schemas.microsoft.com/office/word/2010/wordml" xmlns:w15="http://schemas.microsoft.com/office/word/2012/wordml" xmlns:w16cid="http://schemas.microsoft.com/office/word/2016/wordml/cid" xmlns:w16se="http://schemas.microsoft.com/office/word/2015/wordml/symex" mc:Ignorable="w14 w15 w16se w16cid">
   <w:docDefaults>
     <w:rPrDefault>
       <w:rPr>
@@ -4000,7 +3807,7 @@
       </w:pPr>
     </w:pPrDefault>
   </w:docDefaults>
-  <w:latentStyles w:defLockedState="0" w:defUIPriority="99" w:defSemiHidden="0" w:defUnhideWhenUsed="0" w:defQFormat="0" w:count="376">
+  <w:latentStyles w:defLockedState="0" w:defUIPriority="99" w:defSemiHidden="0" w:defUnhideWhenUsed="0" w:defQFormat="0" w:count="375">
     <w:lsdException w:name="Normal" w:uiPriority="0" w:qFormat="1"/>
     <w:lsdException w:name="heading 1" w:uiPriority="9" w:qFormat="1"/>
     <w:lsdException w:name="heading 2" w:semiHidden="1" w:uiPriority="9" w:unhideWhenUsed="1" w:qFormat="1"/>
@@ -4376,7 +4183,6 @@
     <w:lsdException w:name="Smart Hyperlink" w:semiHidden="1" w:unhideWhenUsed="1"/>
     <w:lsdException w:name="Hashtag" w:semiHidden="1" w:unhideWhenUsed="1"/>
     <w:lsdException w:name="Unresolved Mention" w:semiHidden="1" w:unhideWhenUsed="1"/>
-    <w:lsdException w:name="Smart Link" w:semiHidden="1" w:unhideWhenUsed="1"/>
   </w:latentStyles>
   <w:style w:type="paragraph" w:default="1" w:styleId="Normal">
     <w:name w:val="Normal"/>
@@ -4927,12 +4733,9 @@
 </file>
 
 <file path=customXml/item1.xml><?xml version="1.0" encoding="utf-8"?>
-<?mso-contentType ?>
-<FormTemplates xmlns="http://schemas.microsoft.com/sharepoint/v3/contenttype/forms">
-  <Display>DocumentLibraryForm</Display>
-  <Edit>DocumentLibraryForm</Edit>
-  <New>DocumentLibraryForm</New>
-</FormTemplates>
+<p:properties xmlns:p="http://schemas.microsoft.com/office/2006/metadata/properties" xmlns:xsi="http://www.w3.org/2001/XMLSchema-instance" xmlns:pc="http://schemas.microsoft.com/office/infopath/2007/PartnerControls">
+  <documentManagement/>
+</p:properties>
 </file>
 
 <file path=customXml/item2.xml><?xml version="1.0" encoding="utf-8"?>
@@ -5145,15 +4948,19 @@
 </file>
 
 <file path=customXml/item3.xml><?xml version="1.0" encoding="utf-8"?>
-<p:properties xmlns:p="http://schemas.microsoft.com/office/2006/metadata/properties" xmlns:xsi="http://www.w3.org/2001/XMLSchema-instance" xmlns:pc="http://schemas.microsoft.com/office/infopath/2007/PartnerControls">
-  <documentManagement/>
-</p:properties>
+<?mso-contentType ?>
+<FormTemplates xmlns="http://schemas.microsoft.com/sharepoint/v3/contenttype/forms">
+  <Display>DocumentLibraryForm</Display>
+  <Edit>DocumentLibraryForm</Edit>
+  <New>DocumentLibraryForm</New>
+</FormTemplates>
 </file>
 
 <file path=customXml/itemProps1.xml><?xml version="1.0" encoding="utf-8"?>
-<ds:datastoreItem xmlns:ds="http://schemas.openxmlformats.org/officeDocument/2006/customXml" ds:itemID="{A890BB9D-5285-4575-A4E7-405BEFA10FC5}">
+<ds:datastoreItem xmlns:ds="http://schemas.openxmlformats.org/officeDocument/2006/customXml" ds:itemID="{6D426663-A0D4-4BCE-B7A3-064D59D37B60}">
   <ds:schemaRefs>
-    <ds:schemaRef ds:uri="http://schemas.microsoft.com/sharepoint/v3/contenttype/forms"/>
+    <ds:schemaRef ds:uri="http://schemas.microsoft.com/office/2006/metadata/properties"/>
+    <ds:schemaRef ds:uri="http://schemas.microsoft.com/office/infopath/2007/PartnerControls"/>
   </ds:schemaRefs>
 </ds:datastoreItem>
 </file>
@@ -5178,10 +4985,9 @@
 </file>
 
 <file path=customXml/itemProps3.xml><?xml version="1.0" encoding="utf-8"?>
-<ds:datastoreItem xmlns:ds="http://schemas.openxmlformats.org/officeDocument/2006/customXml" ds:itemID="{6D426663-A0D4-4BCE-B7A3-064D59D37B60}">
+<ds:datastoreItem xmlns:ds="http://schemas.openxmlformats.org/officeDocument/2006/customXml" ds:itemID="{A890BB9D-5285-4575-A4E7-405BEFA10FC5}">
   <ds:schemaRefs>
-    <ds:schemaRef ds:uri="http://schemas.microsoft.com/office/2006/metadata/properties"/>
-    <ds:schemaRef ds:uri="http://schemas.microsoft.com/office/infopath/2007/PartnerControls"/>
+    <ds:schemaRef ds:uri="http://schemas.microsoft.com/sharepoint/v3/contenttype/forms"/>
   </ds:schemaRefs>
 </ds:datastoreItem>
 </file>
</xml_diff>